<commit_message>
Add NextStudy notebook, portfolio & screenshots
Add a Jupyter notebook (new/NextStudy_Notebook 2.ipynb) that documents NextStudy usage with examples (loading index.py, creating themes, generating a weighted study plan, marking tasks done, showing statistics, JSON export, menu dispatch table and error handling). Update NextStudy_Portfolio.docx and add UI screenshots under new/screenshots 2/. Also includes an updated new/.DS_Store entry.
</commit_message>
<xml_diff>
--- a/new/NextStudy_Portfolio.docx
+++ b/new/NextStudy_Portfolio.docx
@@ -101,13 +101,7 @@
           <w:sz w:val="24"/>
           <w:szCs w:val="24"/>
         </w:rPr>
-        <w:t>Bei NextStudy geht es um ein Problem, das wir selber gut kennen: Man hat mehrere Themen für eine Arbeit oder Prüfung, aber am Anfang weiß man oft nicht, womit man anfangen soll. Dann schiebt man die Planung vor sich her und verliert Zeit, obwohl man eigentlich schon lernen könnte.</w:t>
-      </w:r>
-      <w:r>
-        <w:rPr>
-          <w:sz w:val="24"/>
-          <w:szCs w:val="24"/>
-        </w:rPr>
+        <w:t xml:space="preserve">Bei NextStudy geht es um ein Problem, das wir selber gut kennen: Man hat mehrere Themen für eine Arbeit oder Prüfung, aber am Anfang weiß man oft nicht, womit man anfangen soll. Dann schiebt man die Planung vor sich her und verliert Zeit, obwohl man </w:t>
       </w:r>
       <w:proofErr w:type="spellStart"/>
       <w:r>
@@ -115,6 +109,7 @@
           <w:sz w:val="24"/>
           <w:szCs w:val="24"/>
         </w:rPr>
+        <w:t>eigentlich</w:t>
       </w:r>
       <w:proofErr w:type="spellEnd"/>
       <w:r>
@@ -122,6 +117,7 @@
           <w:sz w:val="24"/>
           <w:szCs w:val="24"/>
         </w:rPr>
+        <w:t xml:space="preserve"> </w:t>
       </w:r>
       <w:proofErr w:type="spellStart"/>
       <w:r>
@@ -129,6 +125,7 @@
           <w:sz w:val="24"/>
           <w:szCs w:val="24"/>
         </w:rPr>
+        <w:t>schon</w:t>
       </w:r>
       <w:proofErr w:type="spellEnd"/>
       <w:r>
@@ -136,6 +133,7 @@
           <w:sz w:val="24"/>
           <w:szCs w:val="24"/>
         </w:rPr>
+        <w:t xml:space="preserve"> </w:t>
       </w:r>
       <w:proofErr w:type="spellStart"/>
       <w:r>
@@ -143,12 +141,7 @@
           <w:sz w:val="24"/>
           <w:szCs w:val="24"/>
         </w:rPr>
-      </w:r>
-      <w:r>
-        <w:rPr>
-          <w:sz w:val="24"/>
-          <w:szCs w:val="24"/>
-        </w:rPr>
+        <w:t>lernen</w:t>
       </w:r>
       <w:proofErr w:type="spellEnd"/>
       <w:r>
@@ -156,20 +149,7 @@
           <w:sz w:val="24"/>
           <w:szCs w:val="24"/>
         </w:rPr>
-      </w:r>
-      <w:proofErr w:type="gramStart"/>
-      <w:r>
-        <w:rPr>
-          <w:sz w:val="24"/>
-          <w:szCs w:val="24"/>
-        </w:rPr>
-      </w:r>
-      <w:proofErr w:type="gramEnd"/>
-      <w:r>
-        <w:rPr>
-          <w:sz w:val="24"/>
-          <w:szCs w:val="24"/>
-        </w:rPr>
+        <w:t xml:space="preserve"> </w:t>
       </w:r>
       <w:proofErr w:type="spellStart"/>
       <w:r>
@@ -177,6 +157,7 @@
           <w:sz w:val="24"/>
           <w:szCs w:val="24"/>
         </w:rPr>
+        <w:t>könnte</w:t>
       </w:r>
       <w:proofErr w:type="spellEnd"/>
       <w:r>
@@ -184,6 +165,7 @@
           <w:sz w:val="24"/>
           <w:szCs w:val="24"/>
         </w:rPr>
+        <w:t>.</w:t>
       </w:r>
     </w:p>
     <w:p>
@@ -326,7 +308,55 @@
           <w:sz w:val="24"/>
           <w:szCs w:val="24"/>
         </w:rPr>
-        <w:t xml:space="preserve"> ein paar Eingaben einen Lernplan macht. </w:t>
+        <w:t xml:space="preserve"> </w:t>
+      </w:r>
+      <w:proofErr w:type="spellStart"/>
+      <w:r>
+        <w:rPr>
+          <w:sz w:val="24"/>
+          <w:szCs w:val="24"/>
+        </w:rPr>
+        <w:t>ein</w:t>
+      </w:r>
+      <w:proofErr w:type="spellEnd"/>
+      <w:r>
+        <w:rPr>
+          <w:sz w:val="24"/>
+          <w:szCs w:val="24"/>
+        </w:rPr>
+        <w:t xml:space="preserve"> </w:t>
+      </w:r>
+      <w:proofErr w:type="spellStart"/>
+      <w:r>
+        <w:rPr>
+          <w:sz w:val="24"/>
+          <w:szCs w:val="24"/>
+        </w:rPr>
+        <w:t>paar</w:t>
+      </w:r>
+      <w:proofErr w:type="spellEnd"/>
+      <w:r>
+        <w:rPr>
+          <w:sz w:val="24"/>
+          <w:szCs w:val="24"/>
+        </w:rPr>
+        <w:t xml:space="preserve"> </w:t>
+      </w:r>
+      <w:proofErr w:type="spellStart"/>
+      <w:r>
+        <w:rPr>
+          <w:sz w:val="24"/>
+          <w:szCs w:val="24"/>
+        </w:rPr>
+        <w:t>Eingaben</w:t>
+      </w:r>
+      <w:proofErr w:type="spellEnd"/>
+      <w:r>
+        <w:rPr>
+          <w:sz w:val="24"/>
+          <w:szCs w:val="24"/>
+        </w:rPr>
+        <w:t xml:space="preserve"> einen Lernplan macht. </w:t>
       </w:r>
       <w:proofErr w:type="gramStart"/>
       <w:r>
@@ -366,22 +396,47 @@
           <w:sz w:val="24"/>
           <w:szCs w:val="24"/>
         </w:rPr>
+        <w:t xml:space="preserve"> war </w:t>
+      </w:r>
+      <w:proofErr w:type="spellStart"/>
+      <w:r>
+        <w:rPr>
+          <w:sz w:val="24"/>
+          <w:szCs w:val="24"/>
+        </w:rPr>
+        <w:t>wichtig</w:t>
+      </w:r>
+      <w:proofErr w:type="spellEnd"/>
+      <w:r>
+        <w:rPr>
+          <w:sz w:val="24"/>
+          <w:szCs w:val="24"/>
+        </w:rPr>
+        <w:t xml:space="preserve">, </w:t>
+      </w:r>
+      <w:proofErr w:type="spellStart"/>
+      <w:r>
+        <w:rPr>
+          <w:sz w:val="24"/>
+          <w:szCs w:val="24"/>
+        </w:rPr>
+        <w:t>dass</w:t>
+      </w:r>
+      <w:proofErr w:type="spellEnd"/>
+      <w:r>
+        <w:rPr>
+          <w:sz w:val="24"/>
+          <w:szCs w:val="24"/>
+        </w:rPr>
         <w:t xml:space="preserve"> </w:t>
       </w:r>
-      <w:r>
-        <w:rPr>
-          <w:sz w:val="24"/>
-          <w:szCs w:val="24"/>
-        </w:rPr>
-        <w:t xml:space="preserve">war </w:t>
-      </w:r>
       <w:proofErr w:type="spellStart"/>
       <w:r>
         <w:rPr>
           <w:sz w:val="24"/>
           <w:szCs w:val="24"/>
         </w:rPr>
-        <w:t>wichtig</w:t>
+        <w:t>schwere</w:t>
       </w:r>
       <w:proofErr w:type="spellEnd"/>
       <w:r>
@@ -389,7 +444,7 @@
           <w:sz w:val="24"/>
           <w:szCs w:val="24"/>
         </w:rPr>
-        <w:t xml:space="preserve">, </w:t>
+        <w:t xml:space="preserve"> </w:t>
       </w:r>
       <w:proofErr w:type="spellStart"/>
       <w:r>
@@ -397,7 +452,7 @@
           <w:sz w:val="24"/>
           <w:szCs w:val="24"/>
         </w:rPr>
-        <w:t>dass</w:t>
+        <w:t>Themen</w:t>
       </w:r>
       <w:proofErr w:type="spellEnd"/>
       <w:r>
@@ -405,7 +460,7 @@
           <w:sz w:val="24"/>
           <w:szCs w:val="24"/>
         </w:rPr>
-        <w:t xml:space="preserve"> </w:t>
+        <w:t xml:space="preserve"> nicht </w:t>
       </w:r>
       <w:proofErr w:type="spellStart"/>
       <w:r>
@@ -413,7 +468,7 @@
           <w:sz w:val="24"/>
           <w:szCs w:val="24"/>
         </w:rPr>
-        <w:t>schwere</w:t>
+        <w:t>genauso</w:t>
       </w:r>
       <w:proofErr w:type="spellEnd"/>
       <w:r>
@@ -421,7 +476,7 @@
           <w:sz w:val="24"/>
           <w:szCs w:val="24"/>
         </w:rPr>
-        <w:t xml:space="preserve"> Themen nicht genauso behandelt werden wie leichte Themen. Deshalb bekommen sie im Programm eine höhere Gewichtung. Schwere Themen kommen dadurch früher oder öfter im Plan vor. Am Ende wird außerdem Wiederholung eingeplant, weil man kurz vor einer Prüfung nicht nur neue Themen lernen sollte.</w:t>
+        <w:t xml:space="preserve"> behandelt werden wie leichte Themen. Deshalb bekommen sie im Programm eine höhere Gewichtung. Schwere Themen kommen dadurch früher oder öfter im Plan vor. Am Ende wird außerdem Wiederholung eingeplant, weil man kurz vor einer Prüfung nicht nur neue Themen lernen sollte.</w:t>
       </w:r>
     </w:p>
     <w:p>
@@ -700,20 +755,6 @@
         </w:rPr>
         <w:t>Damit man das Programm nicht immer über einen Terminalbefehl starten muss, haben wir zusätzlich zwei Startdateien angelegt. Unter Windows kann man `start_nextstudy_windows.bat` doppelklicken, unter macOS `start_nextstudy_macos.command`. Beide Dateien öffnen das Terminal und starten `index.py` aus dem richtigen Ordner.</w:t>
       </w:r>
-      <w:proofErr w:type="gramStart"/>
-      <w:r>
-        <w:rPr>
-          <w:sz w:val="24"/>
-          <w:szCs w:val="24"/>
-        </w:rPr>
-      </w:r>
-      <w:proofErr w:type="gramEnd"/>
-      <w:r>
-        <w:rPr>
-          <w:sz w:val="24"/>
-          <w:szCs w:val="24"/>
-        </w:rPr>
-      </w:r>
     </w:p>
     <w:p>
       <w:pPr>
@@ -805,20 +846,6 @@
           <w:szCs w:val="24"/>
         </w:rPr>
         <w:t>Zum Speichern benutzen wir JSON. Das passt gut, weil man Listen und Dictionaries damit gut abspeichern kann. Eigene Python-Objekte können aber nicht direkt als JSON gespeichert werden. Deshalb haben die Klassen die Methode `to_dict()`. Damit werden die Objekte vor dem Speichern in normale Dictionaries umgewandelt.</w:t>
-      </w:r>
-      <w:proofErr w:type="gramStart"/>
-      <w:r>
-        <w:rPr>
-          <w:sz w:val="24"/>
-          <w:szCs w:val="24"/>
-        </w:rPr>
-      </w:r>
-      <w:proofErr w:type="gramEnd"/>
-      <w:r>
-        <w:rPr>
-          <w:sz w:val="24"/>
-          <w:szCs w:val="24"/>
-        </w:rPr>
       </w:r>
     </w:p>
     <w:p>
@@ -1257,21 +1284,6 @@
         <w:t>Programms</w:t>
       </w:r>
       <w:proofErr w:type="spellEnd"/>
-    </w:p>
-    <w:p>
-      <w:pPr>
-        <w:rPr>
-          <w:sz w:val="24"/>
-          <w:szCs w:val="24"/>
-        </w:rPr>
-      </w:pPr>
-      <w:r>
-        <w:rPr>
-          <w:sz w:val="24"/>
-          <w:szCs w:val="24"/>
-        </w:rPr>
-        <w:t>Die Screenshots liegen im Ordner new/screenshots. Sie zeigen die wichtigsten Programmsituationen im Terminal.</w:t>
-      </w:r>
     </w:p>
     <w:p>
       <w:pPr>
@@ -2093,7 +2105,7 @@
   <w:abstractNum w:abstractNumId="8" w15:restartNumberingAfterBreak="0">
     <w:nsid w:val="FFFFFF89"/>
     <w:multiLevelType w:val="singleLevel"/>
-    <w:tmpl w:val="29761A62"/>
+    <w:tmpl w:val="CC76861E"/>
     <w:lvl w:ilvl="0">
       <w:start w:val="1"/>
       <w:numFmt w:val="bullet"/>

</xml_diff>